<commit_message>
Update thesis docs and comparison report paths
</commit_message>
<xml_diff>
--- a/bukuThesis/bahan/progres_BAba Progress PEnelitian dan Skenario pengujian_updated.docx
+++ b/bukuThesis/bahan/progres_BAba Progress PEnelitian dan Skenario pengujian_updated.docx
@@ -1431,6 +1431,18 @@
       <w:pPr/>
       <w:r>
         <w:t>Ringkasan hasil komparatif utama menggunakan lima fold terakhir, yaitu fold 17 sampai fold 21. Pemilihan lima fold terakhir dimaksudkan untuk merepresentasikan rezim pasar terbaru yang lebih relevan secara operasional, sehingga hasil pada bagian ini ditafsirkan sebagai kinerja model pada kondisi pasar terbaru, bukan sebagai satu-satunya estimasi performa untuk seluruh horizon historis.</w:t>
+      </w:r>
+    </w:p>
+    <w:p>
+      <w:pPr/>
+      <w:r>
+        <w:t>Horizon uji 1 bulan dipilih sebagai fokus utama karena memberikan keseimbangan yang lebih baik antara relevansi operasional pasar forex dan kecukupan sampel evaluasi pada timeframe 4H. Dengan horizon ini, model tetap diuji pada kondisi pasar terbaru, tetapi jumlah observasi uji masih cukup untuk menghasilkan perbandingan yang bermakna antar model.</w:t>
+      </w:r>
+    </w:p>
+    <w:p>
+      <w:pPr/>
+      <w:r>
+        <w:t>Jendela training 72 bulan dipilih sebagai keputusan desain evaluasi untuk menyediakan konteks historis yang cukup panjang dan menjaga fairness protokol antar model. Pilihan ini tidak dimaknai sebagai klaim bahwa 72 bulan adalah nilai train window terbaik secara absolut, melainkan sebagai konfigurasi evaluasi utama yang rasional dan konsisten untuk ARIMA, FLF-LSTM, dan FLF-BiLSTM.</w:t>
       </w:r>
     </w:p>
     <w:p>

</xml_diff>